<commit_message>
Reframe portfolio narrative; add architecture notes and integration CI
Lead with the capstones (exact-optimal decoder, Google reproduction), add a 'what this is / is not' section, and label the simulator as infrastructure. Document the multi-repo trade-off in docs/ARCHITECTURE.md and add an integration workflow that installs the core chain (simulator -> benchmark -> reproduction) from main and runs a cross-repo smoke test. Regenerate the writeups so the overview leads with the flagship result and reflects the decoder-tier and ML-negative-study changes.
</commit_message>
<xml_diff>
--- a/writeups/docx/00_portfolio_overview.docx
+++ b/writeups/docx/00_portfolio_overview.docx
@@ -42,7 +42,7 @@
         <w:spacing w:after="120"/>
       </w:pPr>
       <w:r>
-        <w:t>This document introduces a seven-part software portfolio in quantum error correction (QEC) that follows a single technical arc: simulate the surface code at the circuit level, decode it with classical and machine-learning algorithms, make the resulting metrics observable, and then use the same physics to answer two questions that matter for fault tolerance - how far practical decoders are from optimal, and how many physical qubits a cryptographically relevant computation would require. Each component is an independent, installable, tested and continuously integrated Python package; the later components depend on the earlier ones. Headline results obtained across the portfolio include a circuit-level threshold near 0.6%, a quantitative demonstration that belief propagation is dominated on the surface code by matching-based decoders, a calibrated reproduction of the roughly twenty-million-qubit, eight-hour estimate for Shor's algorithm on RSA-2048, a simulation reproduction of the error-suppression scaling reported by Google in 2023 (suppression factor near 2.2 below threshold), and an exact measurement of the small but growing sub-optimality of minimum-weight perfect matching relative to maximum-likelihood decoding.</w:t>
+        <w:t>This document introduces a seven-part software portfolio in quantum error correction (QEC). Its flagship result is an exact, sampling-free measurement of how far the standard minimum-weight perfect matching decoder sits from the provably optimal maximum-likelihood decoder: by enumerating every error pattern of small surface codes, matching is shown to be exactly optimal at distance three and only slightly sub-optimal at distance five. Around that core result the portfolio follows a single technical arc: simulate the surface code at the circuit level, decode it with classical and machine-learning algorithms, make the resulting metrics observable, and use the same physics to estimate the physical-qubit cost of a cryptographically relevant computation. Each component is an independent, installable, tested and continuously integrated Python package; the later components depend on the earlier ones. Further headline results include a circuit-level threshold near 0.6%, a quantitative demonstration that plain belief propagation is dominated on the surface code by matching-based decoders, a calibrated reproduction of the roughly twenty-million-qubit, eight-hour estimate for Shor's algorithm on RSA-2048, and a simulation reproduction of the error-suppression scaling reported by Google in 2023 (suppression factor near 2.2 below threshold).</w:t>
       </w:r>
     </w:p>
     <w:p>
@@ -221,7 +221,7 @@
     </w:p>
     <w:p>
       <w:r>
-        <w:t>The economics model reproduces the canonical roughly twenty-million-qubit, eight-hour estimate for factoring RSA-2048 with Shor's algorithm, and identifies the physical error rate as the dominant cost lever because it enters the required code distance exponentially. The reproduction capstones recover, respectively, an error-suppression factor near 2.2 below threshold and an exact matching sub-optimality that is unity at distance three and grows slowly at distance five.</w:t>
+        <w:t>The economics model reproduces the canonical roughly twenty-million-qubit, eight-hour estimate for factoring RSA-2048 with Shor's algorithm, identifies the physical error rate as the dominant cost lever because it enters the required code distance exponentially, and tracks the cost frontier forward to the 2025 state of the art (Gidney, arXiv:2505.15917), which lowers the estimate by roughly twentyfold to under one million physical qubits. The reproduction capstones recover, respectively, an error-suppression factor near 2.2 below threshold and an exact matching sub-optimality that is unity at distance three and grows slowly at distance five.</w:t>
       </w:r>
     </w:p>
     <w:p>
@@ -280,6 +280,14 @@
       </w:pPr>
       <w:r>
         <w:t>Gidney C, Ekera M. How to factor 2048 bit RSA integers in 8 hours using 20 million noisy qubits. Quantum 2021; 5:433.</w:t>
+      </w:r>
+    </w:p>
+    <w:p>
+      <w:pPr>
+        <w:spacing w:after="80"/>
+      </w:pPr>
+      <w:r>
+        <w:t>Gidney C. How to factor 2048 bit RSA integers with less than a million noisy qubits. arXiv:2505.15917, 2025.</w:t>
       </w:r>
     </w:p>
     <w:p>

</xml_diff>

<commit_message>
Expand portfolio to ten parts: add qLDPC, noise-profiles and FT-compiler repos
Add frontier repos 8-10 (qldpc-builder, qec-noise-profiles, active-volume-compiler) to the landing README table and dependency graph, extend the integration smoke test and CI to install and exercise them, document them as standalone in ARCHITECTURE.md, and add writeups 08-10 with embedded figures.
</commit_message>
<xml_diff>
--- a/writeups/docx/00_portfolio_overview.docx
+++ b/writeups/docx/00_portfolio_overview.docx
@@ -42,7 +42,7 @@
         <w:spacing w:after="120"/>
       </w:pPr>
       <w:r>
-        <w:t>This document introduces a seven-part software portfolio in quantum error correction (QEC). Its flagship result is an exact, sampling-free measurement of how far the standard minimum-weight perfect matching decoder sits from the provably optimal maximum-likelihood decoder: by enumerating every error pattern of small surface codes, matching is shown to be exactly optimal at distance three and only slightly sub-optimal at distance five. Around that core result the portfolio follows a single technical arc: simulate the surface code at the circuit level, decode it with classical and machine-learning algorithms, make the resulting metrics observable, and use the same physics to estimate the physical-qubit cost of a cryptographically relevant computation. Each component is an independent, installable, tested and continuously integrated Python package; the later components depend on the earlier ones. Further headline results include a circuit-level threshold near 0.6%, a quantitative demonstration that plain belief propagation is dominated on the surface code by matching-based decoders, a calibrated reproduction of the roughly twenty-million-qubit, eight-hour estimate for Shor's algorithm on RSA-2048, and a simulation reproduction of the error-suppression scaling reported by Google in 2023 (suppression factor near 2.2 below threshold).</w:t>
+        <w:t>This document introduces a ten-part software portfolio in quantum error correction (QEC). Its flagship result is an exact, sampling-free measurement of how far the standard minimum-weight perfect matching decoder sits from the provably optimal maximum-likelihood decoder: by enumerating every error pattern of small surface codes, matching is shown to be exactly optimal at distance three and only slightly sub-optimal at distance five. Around that core result the portfolio follows a single technical arc: simulate the surface code at the circuit level, decode it with classical and machine-learning algorithms, make the resulting metrics observable, and use the same physics to estimate the physical-qubit cost of a cryptographically relevant computation. Each component is an independent, installable, tested and continuously integrated Python package; the later components depend on the earlier ones. Further headline results include a circuit-level threshold near 0.6%, a quantitative demonstration that plain belief propagation is dominated on the surface code by matching-based decoders, a calibrated reproduction of the roughly twenty-million-qubit, eight-hour estimate for Shor's algorithm on RSA-2048, and a simulation reproduction of the error-suppression scaling reported by Google in 2023 (suppression factor near 2.2 below threshold). Three further repositories extend the portfolio to the frontier beyond the surface code: a from-scratch builder and BP+OSD decoder for bivariate-bicycle qLDPC codes, a study of biased noise and heralded erasure that reproduces the analytic one-half erasure threshold with a from-scratch peeling decoder, and a fault-tolerant resource compiler that optimises the magic-state factory ratio to minimise spacetime volume.</w:t>
       </w:r>
     </w:p>
     <w:p>
@@ -60,7 +60,7 @@
     </w:p>
     <w:p>
       <w:r>
-        <w:t>This portfolio was built to demonstrate that breadth as a coherent body of work rather than as isolated scripts. It is organised as seven independent repositories connected by explicit dependencies, so that each can be read on its own while the whole forms a pipeline from first-principles simulation to decision-ready resource estimates. The remainder of this document summarises the arc, the engineering standards shared across the repositories, and the principal quantitative findings.</w:t>
+        <w:t>This portfolio was built to demonstrate that breadth as a coherent body of work rather than as isolated scripts. It is organised as ten independent repositories, the first seven connected by explicit dependencies into a pipeline from first-principles simulation to decision-ready resource estimates, and three further standalone repositories covering qLDPC codes, hardware-realistic noise and fault-tolerant compilation. The remainder of this document summarises the arc, the engineering standards shared across the repositories, and the principal quantitative findings.</w:t>
       </w:r>
     </w:p>
     <w:p>

</xml_diff>

<commit_message>
Add manifest-driven portfolio index and use American spelling throughout
</commit_message>
<xml_diff>
--- a/writeups/docx/00_portfolio_overview.docx
+++ b/writeups/docx/00_portfolio_overview.docx
@@ -42,7 +42,7 @@
         <w:spacing w:after="120"/>
       </w:pPr>
       <w:r>
-        <w:t>This document introduces a ten-part software portfolio in quantum error correction (QEC). Its flagship result is an exact, sampling-free measurement of how far the standard minimum-weight perfect matching decoder sits from the provably optimal maximum-likelihood decoder: by enumerating every error pattern of small surface codes, matching is shown to be exactly optimal at distance three and only slightly sub-optimal at distance five. Around that core result the portfolio follows a single technical arc: simulate the surface code at the circuit level, decode it with classical and machine-learning algorithms, make the resulting metrics observable, and use the same physics to estimate the physical-qubit cost of a cryptographically relevant computation. Each component is an independent, installable, tested and continuously integrated Python package; the later components depend on the earlier ones. Further headline results include a circuit-level threshold near 0.6%, a quantitative demonstration that plain belief propagation is dominated on the surface code by matching-based decoders, a calibrated reproduction of the roughly twenty-million-qubit, eight-hour estimate for Shor's algorithm on RSA-2048, and a simulation reproduction of the error-suppression scaling reported by Google in 2023 (suppression factor near 2.2 below threshold). Three further repositories extend the portfolio to the frontier beyond the surface code: a from-scratch builder and BP+OSD decoder for bivariate-bicycle qLDPC codes, a study of biased noise and heralded erasure that reproduces the analytic one-half erasure threshold with a from-scratch peeling decoder, and a fault-tolerant resource compiler that optimises the magic-state factory ratio to minimise spacetime volume.</w:t>
+        <w:t>This document introduces a ten-part software portfolio in quantum error correction (QEC). Its flagship result is an exact, sampling-free measurement of how far the standard minimum-weight perfect matching decoder sits from the provably optimal maximum-likelihood decoder: by enumerating every error pattern of small surface codes, matching is shown to be exactly optimal at distance three and only slightly sub-optimal at distance five. Around that core result the portfolio follows a single technical arc: simulate the surface code at the circuit level, decode it with classical and machine-learning algorithms, make the resulting metrics observable, and use the same physics to estimate the physical-qubit cost of a cryptographically relevant computation. Each component is an independent, installable, tested and continuously integrated Python package; the later components depend on the earlier ones. Further headline results include a circuit-level threshold near 0.6%, a quantitative demonstration that plain belief propagation is dominated on the surface code by matching-based decoders, a calibrated reproduction of the roughly twenty-million-qubit, eight-hour estimate for Shor's algorithm on RSA-2048, and a simulation reproduction of the error-suppression scaling reported by Google in 2023 (suppression factor near 2.2 below threshold). Three further repositories extend the portfolio to the frontier beyond the surface code: a from-scratch builder and BP+OSD decoder for bivariate-bicycle qLDPC codes, a study of biased noise and heralded erasure that reproduces the analytic one-half erasure threshold with a from-scratch peeling decoder, and a fault-tolerant resource compiler that optimizes the magic-state factory ratio to minimize spacetime volume.</w:t>
       </w:r>
     </w:p>
     <w:p>
@@ -55,12 +55,12 @@
     </w:p>
     <w:p>
       <w:r>
-        <w:t>Quantum error correction is the central engineering obstacle between today's noisy quantum processors and large-scale fault-tolerant computation. The surface code is the leading candidate for near-term hardware because it requires only nearest-neighbour two-qubit gates on a two-dimensional lattice and tolerates a comparatively high physical error rate. Understanding the surface code in depth therefore requires fluency across several disciplines: the physics of stabiliser codes and thresholds, the algorithmics of decoding, the statistics of rare-event estimation, and the software engineering needed to make all of this reproducible.</w:t>
+        <w:t>Quantum error correction is the central engineering obstacle between today's noisy quantum processors and large-scale fault-tolerant computation. The surface code is the leading candidate for near-term hardware because it requires only nearest-neighbor two-qubit gates on a two-dimensional lattice and tolerates a comparatively high physical error rate. Understanding the surface code in depth therefore requires fluency across several disciplines: the physics of stabiliser codes and thresholds, the algorithmics of decoding, the statistics of rare-event estimation, and the software engineering needed to make all of this reproducible.</w:t>
       </w:r>
     </w:p>
     <w:p>
       <w:r>
-        <w:t>This portfolio was built to demonstrate that breadth as a coherent body of work rather than as isolated scripts. It is organised as ten independent repositories, the first seven connected by explicit dependencies into a pipeline from first-principles simulation to decision-ready resource estimates, and three further standalone repositories covering qLDPC codes, hardware-realistic noise and fault-tolerant compilation. The remainder of this document summarises the arc, the engineering standards shared across the repositories, and the principal quantitative findings.</w:t>
+        <w:t>This portfolio was built to demonstrate that breadth as a coherent body of work rather than as isolated scripts. It is organized as ten independent repositories, the first seven connected by explicit dependencies into a pipeline from first-principles simulation to decision-ready resource estimates, and three further standalone repositories covering qLDPC codes, hardware-realistic noise and fault-tolerant compilation. The remainder of this document summarizes the arc, the engineering standards shared across the repositories, and the principal quantitative findings.</w:t>
       </w:r>
     </w:p>
     <w:p>

</xml_diff>

<commit_message>
Neutralize editorializing in write-ups so they read as research documents
</commit_message>
<xml_diff>
--- a/writeups/docx/00_portfolio_overview.docx
+++ b/writeups/docx/00_portfolio_overview.docx
@@ -42,7 +42,7 @@
         <w:spacing w:after="120"/>
       </w:pPr>
       <w:r>
-        <w:t>This document introduces a ten-part software portfolio in quantum error correction (QEC). Its flagship result is an exact, sampling-free measurement of how far the standard minimum-weight perfect matching decoder sits from the provably optimal maximum-likelihood decoder: by enumerating every error pattern of small surface codes, matching is shown to be exactly optimal at distance three and only slightly sub-optimal at distance five. Around that core result the portfolio follows a single technical arc: simulate the surface code at the circuit level, decode it with classical and machine-learning algorithms, make the resulting metrics observable, and use the same physics to estimate the physical-qubit cost of a cryptographically relevant computation. Each component is an independent, installable, tested and continuously integrated Python package; the later components depend on the earlier ones. Further headline results include a circuit-level threshold near 0.6%, a quantitative demonstration that plain belief propagation is dominated on the surface code by matching-based decoders, a calibrated reproduction of the roughly twenty-million-qubit, eight-hour estimate for Shor's algorithm on RSA-2048, and a simulation reproduction of the error-suppression scaling reported by Google in 2023 (suppression factor near 2.2 below threshold). Three further repositories extend the portfolio to the frontier beyond the surface code: a from-scratch builder and BP+OSD decoder for bivariate-bicycle qLDPC codes, a study of biased noise and heralded erasure that reproduces the analytic one-half erasure threshold with a from-scratch peeling decoder, and a fault-tolerant resource compiler that optimizes the magic-state factory ratio to minimize spacetime volume.</w:t>
+        <w:t>This document introduces a ten-part software portfolio in quantum error correction (QEC). Its central result is an exact, sampling-free measurement of how far the standard minimum-weight perfect matching decoder sits from the provably optimal maximum-likelihood decoder: by enumerating every error pattern of small surface codes, matching is shown to be exactly optimal at distance three and only slightly sub-optimal at distance five. Around that core result the portfolio follows a single technical arc: simulate the surface code at the circuit level, decode it with classical and machine-learning algorithms, make the resulting metrics observable, and use the same physics to estimate the physical-qubit cost of a cryptographically relevant computation. Each component is an independent, installable, tested and continuously integrated Python package; the later components depend on the earlier ones. Further results include a circuit-level threshold near 0.6%, a quantitative result that plain belief propagation is dominated on the surface code by matching-based decoders, a calibrated reproduction of the roughly twenty-million-qubit, eight-hour estimate for Shor's algorithm on RSA-2048, and a simulation reproduction of the error-suppression scaling reported by Google in 2023 (suppression factor near 2.2 below threshold). Three further repositories extend the portfolio to the frontier beyond the surface code: a from-scratch builder and BP+OSD decoder for bivariate-bicycle qLDPC codes, a study of biased noise and heralded erasure that reproduces the analytic one-half erasure threshold with a from-scratch peeling decoder, and a fault-tolerant resource compiler that optimizes the magic-state factory ratio to minimize spacetime volume.</w:t>
       </w:r>
     </w:p>
     <w:p>
@@ -60,7 +60,7 @@
     </w:p>
     <w:p>
       <w:r>
-        <w:t>This portfolio was built to demonstrate that breadth as a coherent body of work rather than as isolated scripts. It is organized as ten independent repositories, the first seven connected by explicit dependencies into a pipeline from first-principles simulation to decision-ready resource estimates, and three further standalone repositories covering qLDPC codes, hardware-realistic noise and fault-tolerant compilation. The remainder of this document summarizes the arc, the engineering standards shared across the repositories, and the principal quantitative findings.</w:t>
+        <w:t>The portfolio spans that breadth across ten independent repositories, the first seven connected by explicit dependencies into a pipeline from first-principles simulation to decision-ready resource estimates, and three further standalone repositories covering qLDPC codes, hardware-realistic noise and fault-tolerant compilation. The remainder of this document summarizes the arc, the engineering standards shared across the repositories, and the principal quantitative findings.</w:t>
       </w:r>
     </w:p>
     <w:p>
@@ -198,7 +198,7 @@
     </w:p>
     <w:p>
       <w:r>
-        <w:t>These practices were not cosmetic. Continuous integration on a clean checkout caught a packaging defect that local testing had masked, and the discipline of verifying every citation surfaced and corrected an attribution error in one of the reproduction repositories. The portfolio is intended to read as production-quality research software, not as a notebook dump.</w:t>
+        <w:t>Continuous integration on a clean checkout caught a packaging defect that local testing had masked, and verification of every citation corrected an attribution error in one of the reproduction repositories.</w:t>
       </w:r>
     </w:p>
     <w:p>
@@ -216,7 +216,7 @@
     </w:p>
     <w:p>
       <w:r>
-        <w:t>The decoder benchmark confirms the literature consensus that plain belief propagation is dominated on the surface code: in a representative run, minimum-weight perfect matching achieved the lowest mean logical error rate, union-find was close on accuracy at near-linear cost, and belief propagation was worse on both accuracy and runtime. The machine-learning study reaches an honest, calibrated conclusion - learned decoders are competitive with matching at distance three but degrade sharply at distance five under a fixed training budget - rather than overclaiming.</w:t>
+        <w:t>The decoder benchmark confirms the literature consensus that plain belief propagation is dominated on the surface code: in a representative run, minimum-weight perfect matching achieved the lowest mean logical error rate, union-find was close on accuracy at near-linear cost, and belief propagation was worse on both accuracy and runtime. In the machine-learning study, learned decoders were competitive with matching at distance three but degraded sharply at distance five under a fixed training budget.</w:t>
       </w:r>
     </w:p>
     <w:p>
@@ -234,7 +234,7 @@
     </w:p>
     <w:p>
       <w:r>
-        <w:t>Taken together, the repositories demonstrate the full loop a QEC researcher works in: building trustworthy simulations, implementing and critically comparing decoders, communicating results, and translating physics into strategic estimates. The deliberate scoping of the reproduction projects - reproducing methodology and qualitative conclusions in simulation rather than claiming to match hardware-calibrated absolute numbers - is itself a demonstration of scientific judgement.</w:t>
+        <w:t>The repositories span first-principles simulation, decoder implementation and comparison, presentation of results, and the translation of physics into resource estimates. The reproduction projects were scoped to reproduce methodology and qualitative conclusions in simulation rather than to match hardware-calibrated absolute numbers.</w:t>
       </w:r>
     </w:p>
     <w:p>

</xml_diff>